<commit_message>
docs(qa): sync QA artifacts with the 470-test suite and replace generators
- Test_Case_Explanation_Reference: 535 -> 470 tests, map each case to its
  Report5 sheet/function id, record BE xUnit 232/232 and RAG pytest 39/39,
  flag AI Coach / roadmap / knowledge-folder work as FT-15 out of scope
- Refresh Report5, Report7, TestExecutionGuide, Chuan_Bi_Bao_Ve workbooks
- Replace the four ad-hoc generator scripts with docs/qa/tools/
</commit_message>
<xml_diff>
--- a/docs/qa/Chuan_Bi_Bao_Ve_1.1.docx
+++ b/docs/qa/Chuan_Bi_Bao_Ve_1.1.docx
@@ -183,7 +183,7 @@
         <w:spacing w:after="80"/>
       </w:pPr>
       <w:r>
-        <w:t xml:space="preserve">Có bộ test tự động (Vitest + Testing Library) với 535 test case (100% pass ở lần chạy gần nhất) cho riêng phần Frontend, bao gồm cả test ghi chú lại những hành vi đúng-nhưng-dễ-hiểu-nhầm-là-bug để tránh sửa nhầm sau này.</w:t>
+        <w:t xml:space="preserve">Có bộ test tự động (Vitest + Testing Library) với 470 test case trong 62 file (470/470 pass ở lần chạy gần nhất, 19/09/2026) cho riêng phần Frontend, bao gồm cả test ghi chú lại những hành vi đúng-nhưng-dễ-hiểu-nhầm-là-bug để tránh sửa nhầm sau này.</w:t>
       </w:r>
     </w:p>
     <w:p>
@@ -2460,7 +2460,7 @@
         <w:spacing w:after="80"/>
       </w:pPr>
       <w:r>
-        <w:t xml:space="preserve">Có 535 test case (100% pass ở lần chạy gần nhất) tự động (Vitest + Testing Library) cho phần Frontend, phủ cả các trường hợp “hành vi đúng nhưng dễ nhầm là bug” (ví dụ: nút hiện/ẩn mật khẩu ở ô Confirm biến mất khi hai mật khẩu khớp — hành vi có chủ đích, đã có test ghi chú rõ để tránh sửa nhầm về sau).</w:t>
+        <w:t xml:space="preserve">Có 470 test case tự động trong 62 file (Vitest + Testing Library, 470/470 pass ngày 19/09/2026) cho phần Frontend, phủ cả các trường hợp “hành vi đúng nhưng dễ nhầm là bug” (ví dụ: nút hiện/ẩn mật khẩu ở ô Confirm biến mất khi hai mật khẩu khớp — hành vi có chủ đích, đã có test ghi chú rõ để tránh sửa nhầm về sau).</w:t>
       </w:r>
     </w:p>
     <w:p>
@@ -3076,10 +3076,10 @@
           <w:b/>
           <w:bCs/>
         </w:rPr>
-        <w:t xml:space="preserve">8. QUAN TRỌNG NHẤT — Report 7, mục V. Software Testing Documentation HOÀN TOÀN TRỐNG: </w:t>
-      </w:r>
-      <w:r>
-        <w:t xml:space="preserve">Đã kiểm tra trực tiếp file Report 7 (Final Project Report): toàn bộ mục “V. Software Testing Documentation” chỉ có 18 tiêu đề con (Scope of Testing, Test Strategy, Test Plan, Test Cases, Test Reports, Test Statistics, Test Analysis, Conclusion...) mà KHÔNG có một dòng nội dung nào bên dưới — nhảy thẳng từ tiêu đề “5.3 Conclusion” sang mục VI tiếp theo. Đây là rủi ro nghiêm trọng nhất trong toàn bộ hồ sơ vì TC5 (Kiểm thử) đánh giá trực tiếp dựa trên tài liệu này. Bộ test tự động thật SỰ TỒN TẠI trong repository (535 test case (100% pass ở lần chạy gần nhất), 64 file) — vấn đề là chưa được viết vào đúng chỗ trong Report 7, không phải chưa từng kiểm thử. BẮT BUỘC phải điền mục này trước ngày bảo vệ: nêu phạm vi test, chiến lược test, kế hoạch, danh sách/thống kê test case thật, và tỷ lệ pass/fail kèm nhật ký lỗi thật (dùng đúng danh sách lỗi đã liệt kê ở các mục hạn chế phía trên).</w:t>
+        <w:t xml:space="preserve">8. ĐÃ XỬ LÝ XONG — Report 7, mục V. Software Testing Documentation đã được điền đầy đủ: </w:t>
+      </w:r>
+      <w:r>
+        <w:t xml:space="preserve">Trước đây toàn bộ mục “V. Software Testing Documentation” của Report 7 chỉ có 18 tiêu đề con mà không có một dòng nội dung nào bên dưới — đây từng là rủi ro nghiêm trọng nhất trong hồ sơ vì TC5 (Kiểm thử) chấm trực tiếp dựa trên tài liệu này. Mục này nay đã được viết đầy đủ: phạm vi test theo 15 mã tính năng FT-01…FT-15 kèm cột In Scope, chiến lược và các mức test, công cụ, nhân sự, môi trường, mốc thời gian, danh sách test case, thống kê, phân tích kết quả, nhật ký lỗi và kết luận. Mọi con số đều truy vết được về một lần chạy thật: Frontend 470/470 test case Vitest trong 62 file (19/09/2026), Backend 232/232 unit test xUnit trong 38 test class (15/09/2026), RAG service 39/39 test pytest với Ollama local thật (15/09/2026), integration 6/12 test trên PostgreSQL thật (13/09/2026). Kèm theo hai workbook: Report5_Test_Report.xlsx (348 functional test case theo 10 module) và SU26SE102-GSU26SE52_QA_TestCases.xlsx (393 unit test case trên 57 function sheet). Việc còn lại cần chủ động nêu khi bảo vệ: nhóm tính năng AI Coach, lộ trình ứng viên và import knowledge theo folder được merge ngày 19/09/2026 — sau chu kỳ test này — nên được khai báo thẳng trong bảng phạm vi là FT-15 ngoài phạm vi kiểm thử tự động, hiện chỉ kiểm thử thủ công.</w:t>
       </w:r>
     </w:p>
     <w:p>
@@ -3324,7 +3324,7 @@
         <w:jc w:val="both"/>
       </w:pPr>
       <w:r>
-        <w:t xml:space="preserve">Trả lời gợi ý: Ngược lại — 535 test hiện tại pass chính là VÌ hơn 10 lỗi thật đã được tìm ra và sửa trong quá trình làm (ví dụ lỗi trên), có test khóa lại hành vi đúng để không tái phát, không phải vì chưa từng có lỗi. Cũng nên thẳng thắn nếu bị hỏi kỹ hơn: ở một lần chạy trước đó cùng ngày (17/08), đúng 1 test trong hr-dashboard.test.tsx từng fail do timeout chờ phần tử render, chạy lại thì pass — một ca kiểm thử chưa đủ ổn định (flaky), không phải lỗi logic sản phẩm.</w:t>
+        <w:t xml:space="preserve">Trả lời gợi ý: Ngược lại — 470 test hiện tại pass chính là VÌ hơn 10 lỗi thật đã được tìm ra và sửa trong quá trình làm (ví dụ lỗi trên), có test khóa lại hành vi đúng để không tái phát, không phải vì chưa từng có lỗi. Cũng nên thẳng thắn nếu bị hỏi kỹ hơn: ở một lần chạy trước đó cùng ngày (17/08), đúng 1 test trong hr-dashboard.test.tsx từng fail do timeout chờ phần tử render, chạy lại thì pass — một ca kiểm thử chưa đủ ổn định (flaky), không phải lỗi logic sản phẩm.</w:t>
       </w:r>
     </w:p>
     <w:p>
@@ -3346,7 +3346,7 @@
         <w:jc w:val="both"/>
       </w:pPr>
       <w:r>
-        <w:t xml:space="preserve">Trả lời gợi ý: Chuẩn bị sẵn máy đã cài đủ dependency (npm install xong từ trước), chạy được ngay bằng npm run test -- -t "&lt;tên test&gt;" để lọc đúng 1 test case theo tên/mã khi được hội đồng chỉ định, thay vì chạy lại toàn bộ 535 test mất thời gian. Nên tập chạy thử lệnh này trước ít nhất một lần để không lúng túng thao tác ngay tại buổi.</w:t>
+        <w:t xml:space="preserve">Trả lời gợi ý: Chuẩn bị sẵn máy đã cài đủ dependency (npm install xong từ trước), chạy được ngay bằng npm run test -- -t "&lt;tên test&gt;" để lọc đúng 1 test case theo tên/mã khi được hội đồng chỉ định, thay vì chạy lại toàn bộ 470 test mất thời gian. Nên tập chạy thử lệnh này trước ít nhất một lần để không lúng túng thao tác ngay tại buổi.</w:t>
       </w:r>
     </w:p>
     <w:p>
@@ -3368,7 +3368,7 @@
         <w:jc w:val="both"/>
       </w:pPr>
       <w:r>
-        <w:t xml:space="preserve">Trả lời gợi ý: Có 3 tình huống: (1) Hội đồng đọc đúng mã QA-ID (VD "HIST-10") — mã này được nhúng ngay trong tên test ở code, nên chạy thẳng npm run test -- -t "HIST-10" là ra kết quả (đã tự kiểm chứng thực tế: 1/535 test chạy đúng và pass trong ~13 giây, chủ yếu là thời gian khởi động Vitest). (2) Hội đồng chỉ mô tả bằng lời, không đọc mã — dùng grep -rn "&lt;từ khóa tiếng Anh&gt;" tests/unit/ để tìm ra đúng file/dòng trước (VD grep mã HIST-10 hoặc RGA-SUB-1 ra đúng ngay tests/unit/hr-history.test.tsx:167 và tests/unit/studio-flow.test.tsx:144), rồi chạy -t như trên. (3) Test case đó không có coverage tự động hoặc thuộc phần Backend/RAG — trả lời thẳng là phần này kiểm thử thủ công/thuộc nhóm khác, không né tránh, rồi demo trực tiếp trên UI hoặc nhường lại cho đúng thành viên phụ trách. Điểm mấu chốt: luôn lọc theo TÊN (-t), không lọc theo tên FILE — lọc theo file rất dễ gõ sai (từng gõ nhầm "candidate-biling.test" thiếu 1 chữ "l", Vitest báo lỗi khá mơ hồ "No test files found, exiting with code 1"), trong khi mã QA-ID ngắn, không khoảng trắng, không cần nhớ đường dẫn nên an toàn hơn nhiều khi phải thao tác trực tiếp trước hội đồng.</w:t>
+        <w:t xml:space="preserve">Trả lời gợi ý: Có 3 tình huống: (1) Hội đồng đọc đúng mã QA-ID (VD "HIST-10") — mã này được nhúng ngay trong tên test ở code, nên chạy thẳng npm run test -- -t "HIST-10" là ra kết quả (đã tự kiểm chứng thực tế: 1/470 test chạy đúng và pass trong ~13 giây, chủ yếu là thời gian khởi động Vitest). (2) Hội đồng chỉ mô tả bằng lời, không đọc mã — dùng grep -rn "&lt;từ khóa tiếng Anh&gt;" tests/unit/ để tìm ra đúng file/dòng trước (VD grep mã HIST-10 hoặc RGA-SUB-1 ra đúng ngay tests/unit/hr-history.test.tsx:167 và tests/unit/studio-flow.test.tsx:144), rồi chạy -t như trên. (3) Test case đó không có coverage tự động hoặc thuộc phần Backend/RAG — trả lời thẳng là phần này kiểm thử thủ công/thuộc nhóm khác, không né tránh, rồi demo trực tiếp trên UI hoặc nhường lại cho đúng thành viên phụ trách. Điểm mấu chốt: luôn lọc theo TÊN (-t), không lọc theo tên FILE — lọc theo file rất dễ gõ sai (từng gõ nhầm "candidate-biling.test" thiếu 1 chữ "l", Vitest báo lỗi khá mơ hồ "No test files found, exiting with code 1"), trong khi mã QA-ID ngắn, không khoảng trắng, không cần nhớ đường dẫn nên an toàn hơn nhiều khi phải thao tác trực tiếp trước hội đồng.</w:t>
       </w:r>
     </w:p>
     <w:p>
@@ -3390,7 +3390,7 @@
         <w:jc w:val="both"/>
       </w:pPr>
       <w:r>
-        <w:t xml:space="preserve">Trả lời gợi ý: Không cần học thuộc — đọc trực tiếp từ nguồn có sẵn. (1) Ở mức nghiệp vụ: mỗi dòng trong SU26SE102-GSU26SE52_QA_TestCases.xlsx đã có sẵn Description/Procedure/Expected/Precondition, đọc thẳng ra là đủ. (2) Ở mức code: toàn bộ 535 test đều theo đúng 1 khuôn Arrange–Act–Assert nên chỉ cần thuộc pattern chung thay vì từng test — ví dụ AUTH005-2 (tests/unit/forgot-reset-password.test.tsx:52-59): Arrange dựng component thật (renderWithProviders), Act mô phỏng thao tác người dùng thật qua Testing Library (type email sai định dạng rồi click nút gửi) chứ không gọi thẳng hàm nội bộ, Assert kiểm tra cả 2 chiều — thông báo lỗi hiển thị đúng VÀ API forgotPassword không hề bị gọi khi input sai, tức test khoá đúng luồng validation chặn trước khi ra network chứ không chỉ check giao diện. Nguyên tắc mock: chỉ mock ở ranh giới gọi API/network để test nhanh và ổn định, phần còn lại (render, tương tác, state) đều là component thật nên phản ánh đúng hành vi người dùng. Mỗi file test còn có comment đầu file ghi rõ nó "grounded in" đúng file source nào và map sang đúng sheet Excel nào (VD AUTH005_ForgotResetPassword) — là bằng chứng truy vết trực tiếp nếu bị hỏi "sao biết test này đúng yêu cầu". Nếu gặp 1 test cụ thể không nhớ ngay, được phép mở file tra theo mã QA-ID rồi giải thích trực tiếp tại chỗ — không cần thuộc lòng cả 535 test; nên chọn trước 5-10 test tiêu biểu (mỗi nhóm nghiệp vụ 1-2 cái) để giải thích trôi chảy không cần mở file, phần còn lại tra cứu live là đủ.</w:t>
+        <w:t xml:space="preserve">Trả lời gợi ý: Không cần học thuộc — đọc trực tiếp từ nguồn có sẵn. (1) Ở mức nghiệp vụ: mỗi dòng trong SU26SE102-GSU26SE52_QA_TestCases.xlsx đã có sẵn Description/Procedure/Expected/Precondition, đọc thẳng ra là đủ. (2) Ở mức code: toàn bộ 470 test đều theo đúng 1 khuôn Arrange–Act–Assert nên chỉ cần thuộc pattern chung thay vì từng test — ví dụ AUTH005-2 (tests/unit/forgot-reset-password.test.tsx:52-59): Arrange dựng component thật (renderWithProviders), Act mô phỏng thao tác người dùng thật qua Testing Library (type email sai định dạng rồi click nút gửi) chứ không gọi thẳng hàm nội bộ, Assert kiểm tra cả 2 chiều — thông báo lỗi hiển thị đúng VÀ API forgotPassword không hề bị gọi khi input sai, tức test khoá đúng luồng validation chặn trước khi ra network chứ không chỉ check giao diện. Nguyên tắc mock: chỉ mock ở ranh giới gọi API/network để test nhanh và ổn định, phần còn lại (render, tương tác, state) đều là component thật nên phản ánh đúng hành vi người dùng. Mỗi file test còn có comment đầu file ghi rõ nó "grounded in" đúng file source nào và map sang đúng sheet Excel nào (VD AUTH005_ForgotResetPassword) — là bằng chứng truy vết trực tiếp nếu bị hỏi "sao biết test này đúng yêu cầu". Nếu gặp 1 test cụ thể không nhớ ngay, được phép mở file tra theo mã QA-ID rồi giải thích trực tiếp tại chỗ — không cần thuộc lòng cả 470 test; nên chọn trước 5-10 test tiêu biểu (mỗi nhóm nghiệp vụ 1-2 cái) để giải thích trôi chảy không cần mở file, phần còn lại tra cứu live là đủ.</w:t>
       </w:r>
     </w:p>
     <w:p>
@@ -3843,29 +3843,29 @@
         <w:t xml:space="preserve">Ưu tiên xử lý trước khi hỏi tới: </w:t>
       </w:r>
       <w:r>
-        <w:t xml:space="preserve">Mục V “Software Testing Documentation” của Report 7 hiện hoàn toàn trống (xem chi tiết ở hạn chế số 8, Phần IV) — đây gần như chắc chắn sẽ bị hỏi thẳng nếu phản biện đọc kỹ tài liệu trước buổi, vì hướng dẫn nói rõ giảng viên phản biện “đã đọc toàn bộ báo cáo” trước khi vào buổi.</w:t>
-      </w:r>
-    </w:p>
-    <w:p>
-      <w:pPr>
-        <w:spacing w:after="140"/>
-        <w:jc w:val="both"/>
-      </w:pPr>
-      <w:r>
-        <w:rPr>
-          <w:b/>
-          <w:bCs/>
-        </w:rPr>
-        <w:t xml:space="preserve">Hỏi: Mục Testing Documentation trong Report 7 gần như trống — nhóm kiểm thử thế nào?</w:t>
-      </w:r>
-    </w:p>
-    <w:p>
-      <w:pPr>
-        <w:spacing w:after="140"/>
-        <w:jc w:val="both"/>
-      </w:pPr>
-      <w:r>
-        <w:t xml:space="preserve">Trả lời gợi ý: Thừa nhận thẳng: mục này chưa được viết đầy đủ trong Report 7, đây là thiếu sót về tài liệu, không phải chưa từng kiểm thử — bộ test tự động thật có 535 test case (100% pass ở lần chạy gần nhất) chạy bằng Vitest, có thể mở và chạy trực tiếp ngay tại đây để chứng minh. Sau buổi này nhóm sẽ bổ sung đầy đủ mục V theo đúng cấu trúc đã có sẵn tiêu đề.</w:t>
+        <w:t xml:space="preserve">Mục V “Software Testing Documentation” của Report 7 nay đã được điền đầy đủ (xem hạn chế số 8, Phần IV) — vẫn nên đọc kỹ trước buổi vì phản biện gần như chắc chắn sẽ hỏi vào đây, do hướng dẫn nói rõ giảng viên phản biện “đã đọc toàn bộ báo cáo” trước khi vào buổi. Điểm cần chủ động nêu: nhóm tính năng AI Coach / lộ trình ứng viên / import knowledge theo folder được merge ngày 19/09/2026, sau chu kỳ test này, nên được khai báo thẳng là FT-15 ngoài phạm vi kiểm thử tự động và hiện chỉ kiểm thử thủ công.</w:t>
+      </w:r>
+    </w:p>
+    <w:p>
+      <w:pPr>
+        <w:spacing w:after="140"/>
+        <w:jc w:val="both"/>
+      </w:pPr>
+      <w:r>
+        <w:rPr>
+          <w:b/>
+          <w:bCs/>
+        </w:rPr>
+        <w:t xml:space="preserve">Hỏi: Nhóm kiểm thử thế nào? Mục Testing Documentation trong Report 7 có đầy đủ không?</w:t>
+      </w:r>
+    </w:p>
+    <w:p>
+      <w:pPr>
+        <w:spacing w:after="140"/>
+        <w:jc w:val="both"/>
+      </w:pPr>
+      <w:r>
+        <w:t xml:space="preserve">Trả lời gợi ý: Mục V hiện đã được viết đầy đủ trong Report 7 (bắt đầu khoảng trang 169): phạm vi test theo 15 mã tính năng FT-01…FT-15 kèm cột In Scope, chiến lược và các mức test, kế hoạch và mốc thời gian, danh sách test case, thống kê và phân tích kết quả, nhật ký lỗi và kết luận. Số liệu trong đó đều lấy từ lần chạy thật: Frontend 470/470 test case Vitest (62 file, 19/09/2026), Backend 232/232 unit test xUnit (38 test class, 15/09/2026), RAG service 39/39 test pytest chạy với Ollama local thật (15/09/2026), và 6/12 integration test chạy trên PostgreSQL thật (13/09/2026). Hai workbook kèm theo: Report5_Test_Report.xlsx (348 functional test case theo 10 module nghiệp vụ) và SU26SE102-GSU26SE52_QA_TestCases.xlsx (393 unit test case trên 57 function sheet). Có thể mở và chạy lại trực tiếp ngay tại buổi để chứng minh.</w:t>
       </w:r>
     </w:p>
     <w:p>
@@ -4023,7 +4023,7 @@
         <w:jc w:val="both"/>
       </w:pPr>
       <w:r>
-        <w:t xml:space="preserve">Trả lời gợi ý: 535 test case trong 64 file (Vitest + Testing Library), chạy bằng lệnh npm run test — toàn bộ 535 test PASS ở lần chạy gần nhất (17/08/2026), thời gian chạy khoảng 32 giây. Chuẩn bị sẵn máy đã cài dependency để chạy trực tiếp khi được yêu cầu.</w:t>
+        <w:t xml:space="preserve">Trả lời gợi ý: 470 test case trong 62 file (Vitest + Testing Library), chạy bằng lệnh npm run test — toàn bộ 470 test PASS ở lần chạy gần nhất (19/09/2026), thời gian chạy khoảng 30-60 giây tuỳ máy. Chuẩn bị sẵn máy đã cài dependency để chạy trực tiếp khi được yêu cầu.</w:t>
       </w:r>
     </w:p>
     <w:p>
@@ -4111,7 +4111,7 @@
         <w:jc w:val="both"/>
       </w:pPr>
       <w:r>
-        <w:t xml:space="preserve">Trả lời gợi ý: Xác nhận chắc chắn được cho Frontend (535 test case Vitest, 64 file, 100% pass ở lần chạy gần nhất). Backend/RAG do nằm ngoài phạm vi phần tự kiểm tra kỳ này — cần người phụ trách Backend/RAG xác nhận trực tiếp con số test bên đó, tránh nhận vơ số liệu không thuộc phần mình.</w:t>
+        <w:t xml:space="preserve">Trả lời gợi ý: Xác nhận được cho cả ba phần, vì cả ba đều đã được chạy thật và ghi vào Report 7 mục V. Frontend: 470 test case Vitest trong 62 file, 470/470 pass ngày 19/09/2026. Backend .NET: 232 unit test xUnit trong 38 test class, 232/232 pass ngày 15/09/2026, cộng 6/12 integration test chạy trên PostgreSQL thật ngày 13/09/2026 (6 test Studio/HR smoke còn lại không chạy vì cấu hình mặc định trỏ vào database Azure dùng chung và cần thiết lập SePay). RAG service: 39 test pytest, 39/39 pass ngày 15/09/2026 với Ollama local thật. Lưu ý giữ đúng ranh giới: con số Backend và RAG do thành viên phụ trách hai phần đó chạy, nên nếu hội đồng hỏi sâu vào chi tiết kỹ thuật bên đó thì nhường lại cho đúng người, không nhận vơ phần mình không làm.</w:t>
       </w:r>
     </w:p>
     <w:p>

</xml_diff>